<commit_message>
continued with window function problems and updated documentation.
</commit_message>
<xml_diff>
--- a/da-gym-doumentation .docx
+++ b/da-gym-doumentation .docx
@@ -123,6 +123,42 @@
       <w:proofErr w:type="spellEnd"/>
       <w:r>
         <w:t>()</w:t>
+      </w:r>
+    </w:p>
+    <w:p>
+      <w:pPr>
+        <w:pStyle w:val="ListParagraph"/>
+        <w:numPr>
+          <w:ilvl w:val="0"/>
+          <w:numId w:val="2"/>
+        </w:numPr>
+      </w:pPr>
+      <w:r>
+        <w:t>Lag()</w:t>
+      </w:r>
+    </w:p>
+    <w:p>
+      <w:pPr>
+        <w:pStyle w:val="ListParagraph"/>
+        <w:numPr>
+          <w:ilvl w:val="1"/>
+          <w:numId w:val="2"/>
+        </w:numPr>
+      </w:pPr>
+      <w:r>
+        <w:t>Pull the (X) value from the previous row</w:t>
+      </w:r>
+    </w:p>
+    <w:p>
+      <w:pPr>
+        <w:pStyle w:val="ListParagraph"/>
+        <w:numPr>
+          <w:ilvl w:val="2"/>
+          <w:numId w:val="2"/>
+        </w:numPr>
+      </w:pPr>
+      <w:r>
+        <w:t xml:space="preserve">Define the field I want the value from and pull  a previous record </w:t>
       </w:r>
     </w:p>
     <w:p/>
@@ -185,7 +221,7 @@
         <w:rFonts w:ascii="Courier New" w:hAnsi="Courier New" w:cs="Courier New" w:hint="default"/>
       </w:rPr>
     </w:lvl>
-    <w:lvl w:ilvl="2" w:tplc="04090005" w:tentative="1">
+    <w:lvl w:ilvl="2" w:tplc="04090005">
       <w:start w:val="1"/>
       <w:numFmt w:val="bullet"/>
       <w:lvlText w:val=""/>

</xml_diff>